<commit_message>
Ajusta valor tributario e acrescenta dinamica das 12 acoes de gestao financeira no capitulo, ampliando para ~11 paginas
</commit_message>
<xml_diff>
--- a/saidas/capitulo-coautoria-janguie-diniz-2026-08-21/capitulo-gestao-nova-economia.docx
+++ b/saidas/capitulo-coautoria-janguie-diniz-2026-08-21/capitulo-gestao-nova-economia.docx
@@ -365,7 +365,63 @@
           <w:rFonts w:ascii="Times New Roman" w:hAnsi="Times New Roman"/>
           <w:sz w:val="24"/>
         </w:rPr>
-        <w:t>É por essa razão que considero a gestão tributária eficiente uma das formas mais subestimadas de criação de valor na economia brasileira. Cada real de imposto pago corretamente, sem desperdício por desconhecimento, sem multa por atraso, sem enquadramento tributário inadequado, é um real que permanece disponível para reinvestimento, contratação, inovação. Ao longo de mais de uma década à frente do Grupo Sena, ajudamos empresas de diferentes portes a recuperar e a preservar centenas de milhões de reais que, de outra forma, teriam se perdido em ineficiência tributária — não por sonegação, mas por planejamento. Essa é uma forma de criação de valor que não aparece em pitch deck, mas que decide se uma empresa sobrevive ao próximo ciclo econômico.</w:t>
+        <w:t>No topo dessa pirâmide está a Gestão de Endividamento — a camada que mais aprendi, e da forma mais dura, ao longo das sete falências que atravessei. Dívida, por si só, não é o problema; é ferramenta legítima de crescimento quando financia ativo produtivo, não quando cobre rombo operacional recorrente. O erro que mais vejo, e que mais cometi, é confundir as duas coisas: usar crédito de curto prazo para tapar buraco estrutural, adiando o problema real em vez de resolvê-lo. Cada uma das minhas sete quedas teve, na origem, essa mesma confusão — e é justamente por reconhecer esse padrão, hoje, de fora, que consigo ajudar outros empresários a interromper o ciclo antes que ele se repita neles.</w:t>
+      </w:r>
+    </w:p>
+    <w:p>
+      <w:pPr>
+        <w:spacing w:line="360" w:lineRule="auto" w:after="0"/>
+        <w:ind w:firstLine="709"/>
+        <w:jc w:val="both"/>
+      </w:pPr>
+      <w:r>
+        <w:rPr>
+          <w:rFonts w:ascii="Times New Roman" w:hAnsi="Times New Roman"/>
+          <w:sz w:val="24"/>
+        </w:rPr>
+        <w:t>No capítulo de Gestão Financeira do meu livro, transformo essa pirâmide em algo mais concreto: doze ações práticas que testei e retesei ao longo de mais de uma década à frente do Grupo Sena. Convido o leitor a interromper a leitura por um instante e responder, com honestidade, quantas dessas doze práticas já fazem parte da rotina do seu negócio: ter orçamento formal; definir prioridades de gasto; controlar despesas mês a mês; quitar dívidas antigas antes de assumir novas; criar o hábito de poupar, mesmo que pouco; montar uma reserva de emergência equivalente a três ou seis meses de custo fixo; evitar dívida desnecessária; pesquisar preço antes de qualquer compra relevante; buscar educação financeira de forma contínua; desenvolver uma fonte de renda extra; planejar toda compra grande com antecedência; e manter um planejamento financeiro de longo prazo, não apenas mensal.</w:t>
+      </w:r>
+    </w:p>
+    <w:p>
+      <w:pPr>
+        <w:spacing w:line="360" w:lineRule="auto" w:after="0"/>
+        <w:ind w:firstLine="709"/>
+        <w:jc w:val="both"/>
+      </w:pPr>
+      <w:r>
+        <w:rPr>
+          <w:rFonts w:ascii="Times New Roman" w:hAnsi="Times New Roman"/>
+          <w:sz w:val="24"/>
+        </w:rPr>
+        <w:t>Não é exercício retórico. Na minha experiência prática, empresários que respondem sim a pelo menos oito dessas doze perguntas raramente são surpreendidos por uma crise de caixa que não conseguem atravessar. Os que respondem sim a menos de cinco, quase sempre, já vivem — ou viveram recentemente — algum grau de sufoco financeiro sem conseguir nomear a causa exata. A diferença entre os dois grupos não é o tamanho do negócio, nem o setor em que atuam. É a disciplina de tratar essas doze ações como rotina, não como recurso de emergência.</w:t>
+      </w:r>
+    </w:p>
+    <w:p>
+      <w:pPr>
+        <w:spacing w:line="360" w:lineRule="auto" w:after="0"/>
+        <w:ind w:firstLine="709"/>
+        <w:jc w:val="both"/>
+      </w:pPr>
+      <w:r>
+        <w:rPr>
+          <w:rFonts w:ascii="Times New Roman" w:hAnsi="Times New Roman"/>
+          <w:sz w:val="24"/>
+        </w:rPr>
+        <w:t>Essa é, para mim, a dinâmica mais simples e mais subestimada da Nova Economia: enquanto o mercado celebra modelos de negócio cada vez mais sofisticados, a maioria das empresas que quebram no Brasil não quebra por falta de inovação — quebra por falta dessas doze disciplinas elementares. Antes de perguntar como escalar, o gestor sério deveria perguntar quantas dessas doze caixas ele já consegue marcar.</w:t>
+      </w:r>
+    </w:p>
+    <w:p>
+      <w:pPr>
+        <w:spacing w:line="360" w:lineRule="auto" w:after="0"/>
+        <w:ind w:firstLine="709"/>
+        <w:jc w:val="both"/>
+      </w:pPr>
+      <w:r>
+        <w:rPr>
+          <w:rFonts w:ascii="Times New Roman" w:hAnsi="Times New Roman"/>
+          <w:sz w:val="24"/>
+        </w:rPr>
+        <w:t>É por essa razão que considero a gestão tributária eficiente uma das formas mais subestimadas de criação de valor na economia brasileira. Cada real de imposto pago corretamente, sem desperdício por desconhecimento, sem multa por atraso, sem enquadramento tributário inadequado, é um real que permanece disponível para reinvestimento, contratação, inovação. Ao longo de mais de uma década à frente do Grupo Sena, ajudamos empresas de diferentes portes a recuperar e a preservar milhões de reais que, de outra forma, teriam se perdido em ineficiência tributária — não por sonegação, mas por planejamento. Essa é uma forma de criação de valor que não aparece em pitch deck, mas que decide se uma empresa sobrevive ao próximo ciclo econômico.</w:t>
       </w:r>
     </w:p>
     <w:p>

</xml_diff>

<commit_message>
Acrescenta secao sobre gestao tecnica com a reforma tributaria e comparativo ilustrativo dos 4 regimes (Simples unico, Simples hibrido, Presumido, Real)
</commit_message>
<xml_diff>
--- a/saidas/capitulo-coautoria-janguie-diniz-2026-08-21/capitulo-gestao-nova-economia.docx
+++ b/saidas/capitulo-coautoria-janguie-diniz-2026-08-21/capitulo-gestao-nova-economia.docx
@@ -296,6 +296,118 @@
           <w:sz w:val="24"/>
         </w:rPr>
         <w:t>Há também uma dimensão de inovação na própria filosofia de negócio. Substituí, na gestão de pessoas do Grupo Sena, a avaliação de desempenho formal e burocrática por uma metodologia que chamo de Feedback Alavancado — uma conversa contínua, de abordagem narrativa, que conta a história do que aconteceu em vez de simplesmente apontar o defeito. É uma inovação pequena na superfície, mas profunda no resultado: transforma feedback em construção, não em veredito. E é exatamente esse tipo de inovação — silenciosa, metodológica, replicável — que sustenta negócios capazes de crescer sem perder a alma pelo caminho.</w:t>
+      </w:r>
+    </w:p>
+    <w:p>
+      <w:pPr>
+        <w:spacing w:line="360" w:lineRule="auto" w:after="0"/>
+        <w:ind w:firstLine="709"/>
+        <w:jc w:val="both"/>
+      </w:pPr>
+      <w:r>
+        <w:rPr>
+          <w:rFonts w:ascii="Times New Roman" w:hAnsi="Times New Roman"/>
+          <w:sz w:val="24"/>
+        </w:rPr>
+        <w:t>Mas a inovação que a reforma exige do gestor não é apenas de posicionamento — é técnica, operacional, e muitas vezes urgente. Desde agosto de 2026, o destaque de IBS e CBS na nota fiscal, ainda que em fase de teste, já é obrigatório para quem está no regime regular; a partir de 2027, PIS e Cofins deixam de existir, o IPI vai a zero, o Imposto Seletivo entra em vigor e o split payment passa a separar automaticamente o imposto no momento do pagamento — o que muda, de forma definitiva, o fluxo de caixa de qualquer empresa que hoje se beneficia do intervalo entre receber e recolher. Gestão técnica, na Nova Economia, deixou de significar apenas dominar a legislação vigente; passou a significar antecipar, com precisão, o efeito de uma legislação que ainda está em transição.</w:t>
+      </w:r>
+    </w:p>
+    <w:p>
+      <w:pPr>
+        <w:spacing w:line="360" w:lineRule="auto" w:after="0"/>
+        <w:ind w:firstLine="709"/>
+        <w:jc w:val="both"/>
+      </w:pPr>
+      <w:r>
+        <w:rPr>
+          <w:rFonts w:ascii="Times New Roman" w:hAnsi="Times New Roman"/>
+          <w:sz w:val="24"/>
+        </w:rPr>
+        <w:t>A decisão mais urgente, hoje, é sobre o Simples Nacional. A partir de 2027, quem está no regime precisa escolher entre manter o recolhimento de IBS e CBS dentro da guia única — o chamado regime único — ou apurar esses dois tributos separadamente, por fora do DAS, no que venho chamando de Simples híbrido. A escolha não é trivial: no regime único, o crédito que a empresa gera para quem compra dela se limita ao valor efetivamente recolhido na guia, que é reduzido — o que pode tornar o fornecedor do Simples, paradoxalmente, mais caro na cadeia B2B. No regime híbrido, a empresa gera mais crédito, aproximando-se da lógica dos demais regimes, mas abre mão de parte da simplicidade que tornava o Simples atrativo. A janela para essa escolha abre em setembro de 2026 e tem efeito a partir de janeiro de 2027 — e a maioria dos empresários que atendo ainda não fez essa conta.</w:t>
+      </w:r>
+    </w:p>
+    <w:p>
+      <w:pPr>
+        <w:spacing w:line="360" w:lineRule="auto" w:after="0"/>
+        <w:ind w:firstLine="709"/>
+        <w:jc w:val="both"/>
+      </w:pPr>
+      <w:r>
+        <w:rPr>
+          <w:rFonts w:ascii="Times New Roman" w:hAnsi="Times New Roman"/>
+          <w:sz w:val="24"/>
+        </w:rPr>
+        <w:t>Para tornar esse raciocínio mais concreto, vale um exercício comparativo — ilustrativo, não um cálculo tributário fechado, já que a alíquota final da reforma (a referência oficial estimada soma CBS e IBS em torno de 26,5%, ainda sujeita à fixação definitiva pelo Senado) segue em definição. Imagine uma empresa prestadora de serviços B2B, com faturamento anual de três milhões de reais, avaliando os quatro caminhos hoje disponíveis: Simples Nacional no regime único, Simples híbrido, Lucro Presumido e Lucro Real.</w:t>
+      </w:r>
+    </w:p>
+    <w:p>
+      <w:pPr>
+        <w:spacing w:line="360" w:lineRule="auto" w:after="0"/>
+        <w:ind w:firstLine="709"/>
+        <w:jc w:val="both"/>
+      </w:pPr>
+      <w:r>
+        <w:rPr>
+          <w:rFonts w:ascii="Times New Roman" w:hAnsi="Times New Roman"/>
+          <w:sz w:val="24"/>
+        </w:rPr>
+        <w:t>No Simples regime único, essa empresa mantém a simplicidade operacional que já conhece — uma guia, um cálculo, baixo custo de conformidade. Mas, se a maior parte de sua carteira for formada por outras empresas que precisam de crédito para reduzir sua própria carga tributária, ela corre o risco de perder competitividade: o crédito que consegue oferecer a esses clientes é limitado ao que foi efetivamente recolhido, normalmente inferior ao gerado pelos demais regimes.</w:t>
+      </w:r>
+    </w:p>
+    <w:p>
+      <w:pPr>
+        <w:spacing w:line="360" w:lineRule="auto" w:after="0"/>
+        <w:ind w:firstLine="709"/>
+        <w:jc w:val="both"/>
+      </w:pPr>
+      <w:r>
+        <w:rPr>
+          <w:rFonts w:ascii="Times New Roman" w:hAnsi="Times New Roman"/>
+          <w:sz w:val="24"/>
+        </w:rPr>
+        <w:t>No Simples híbrido, a mesma empresa preserva o enquadramento no Simples — com seus limites de faturamento e menor burocracia trabalhista e societária — mas passa a apurar IBS e CBS separadamente, gerando crédito mais próximo do praticado pelos regimes regulares. O ganho de competitividade em vendas B2B tem, como contrapartida, uma estrutura de apuração mais complexa do que a guia única a que o pequeno empresário está acostumado.</w:t>
+      </w:r>
+    </w:p>
+    <w:p>
+      <w:pPr>
+        <w:spacing w:line="360" w:lineRule="auto" w:after="0"/>
+        <w:ind w:firstLine="709"/>
+        <w:jc w:val="both"/>
+      </w:pPr>
+      <w:r>
+        <w:rPr>
+          <w:rFonts w:ascii="Times New Roman" w:hAnsi="Times New Roman"/>
+          <w:sz w:val="24"/>
+        </w:rPr>
+        <w:t>No Lucro Presumido, a tributação incide sobre uma margem de lucro presumida por atividade, independentemente do resultado real apurado no período — o que favorece empresas com margem efetiva acima da presunção, mas penaliza quem opera com margem apertada ou está em ano de baixa rentabilidade.</w:t>
+      </w:r>
+    </w:p>
+    <w:p>
+      <w:pPr>
+        <w:spacing w:line="360" w:lineRule="auto" w:after="0"/>
+        <w:ind w:firstLine="709"/>
+        <w:jc w:val="both"/>
+      </w:pPr>
+      <w:r>
+        <w:rPr>
+          <w:rFonts w:ascii="Times New Roman" w:hAnsi="Times New Roman"/>
+          <w:sz w:val="24"/>
+        </w:rPr>
+        <w:t>No Lucro Real, a tributação parte do lucro efetivamente apurado — vantajoso para operações com margem reduzida, prejuízo fiscal a compensar, ou volume relevante de crédito tributário a recuperar, mas com o custo de uma estrutura contábil e de controle bem mais robusta do que os demais regimes exigem.</w:t>
+      </w:r>
+    </w:p>
+    <w:p>
+      <w:pPr>
+        <w:spacing w:line="360" w:lineRule="auto" w:after="0"/>
+        <w:ind w:firstLine="709"/>
+        <w:jc w:val="both"/>
+      </w:pPr>
+      <w:r>
+        <w:rPr>
+          <w:rFonts w:ascii="Times New Roman" w:hAnsi="Times New Roman"/>
+          <w:sz w:val="24"/>
+        </w:rPr>
+        <w:t>Não existe, entre esses quatro caminhos, um vencedor universal. Existe o caminho certo para o momento e o perfil de cada empresa — e é exatamente essa conta, feita caso a caso, com dado real e não com regra geral, que separa o gestor técnico do gestor que apenas cumpre obrigação. Fazer essa análise antes da reforma se completar, e não depois, é a diferença entre atravessar a transição pagando o preço da antecipação ou pagando o preço do improviso.</w:t>
       </w:r>
     </w:p>
     <w:p>

</xml_diff>